<commit_message>
commiting before email automation
</commit_message>
<xml_diff>
--- a/COMC16P1.docx
+++ b/COMC16P1.docx
@@ -175,17 +175,17 @@
         <w:rPr>
           <w:b w:val="on"/>
         </w:rPr>
-        <w:t xml:space="preserve"> Step5:Opportunity created in Identified status (ID: 5627576502 )</w:t>
-        <w:br/>
-        <w:drawing>
-          <wp:inline distT="0" distR="0" distB="0" distL="0">
-            <wp:extent cx="5524500" cy="2476500"/>
-            <wp:docPr id="4" name="Drawing 4" descr="Step5:Opportunity created in Identified status (ID: 5627576502 )"/>
-            <a:graphic xmlns:a="http://schemas.openxmlformats.org/drawingml/2006/main">
-              <a:graphicData uri="http://schemas.openxmlformats.org/drawingml/2006/picture">
-                <pic:pic xmlns:pic="http://schemas.openxmlformats.org/drawingml/2006/picture">
-                  <pic:nvPicPr>
-                    <pic:cNvPr id="0" name="Picture 4" descr="Step5:Opportunity created in Identified status (ID: 5627576502 )"/>
+        <w:t xml:space="preserve"> Step5:Opportunity created in Identified status (ID: 2614736311 )</w:t>
+        <w:br/>
+        <w:drawing>
+          <wp:inline distT="0" distR="0" distB="0" distL="0">
+            <wp:extent cx="5524500" cy="2476500"/>
+            <wp:docPr id="4" name="Drawing 4" descr="Step5:Opportunity created in Identified status (ID: 2614736311 )"/>
+            <a:graphic xmlns:a="http://schemas.openxmlformats.org/drawingml/2006/main">
+              <a:graphicData uri="http://schemas.openxmlformats.org/drawingml/2006/picture">
+                <pic:pic xmlns:pic="http://schemas.openxmlformats.org/drawingml/2006/picture">
+                  <pic:nvPicPr>
+                    <pic:cNvPr id="0" name="Picture 4" descr="Step5:Opportunity created in Identified status (ID: 2614736311 )"/>
                     <pic:cNvPicPr>
                       <a:picLocks noChangeAspect="true"/>
                     </pic:cNvPicPr>

</xml_diff>